<commit_message>
fix(audit-response): report unproven upgrade once
A model run counted an upgrade with no base proof as both a shortfall
and an unproven upgrade. State that it is reported only as the latter.

Co-Authored-By: Claude Sonnet 5.5 <noreply@anthropic.com>
Claude-Session: https://claude.ai/code/session_011jjas23m3NwpgZMZpEjChK
</commit_message>
<xml_diff>
--- a/site/docs/audit-response/method.docx
+++ b/site/docs/audit-response/method.docx
@@ -237,7 +237,16 @@
         <w:t xml:space="preserve">install_shortfall</w:t>
       </w:r>
       <w:r>
-        <w:t xml:space="preserve"> per product short of proofs (the license id), one </w:t>
+        <w:t xml:space="preserve"> per product whose proven quantity is below its count in the license metric (the license id; an upgrade with no base proof is reported only as </w:t>
+      </w:r>
+      <w:r>
+        <w:rPr>
+          <w:rFonts w:ascii="Consolas" w:hAnsi="Consolas"/>
+        </w:rPr>
+        <w:t xml:space="preserve">upgrade_without_original</w:t>
+      </w:r>
+      <w:r>
+        <w:t xml:space="preserve">, not also as a shortfall), one </w:t>
       </w:r>
       <w:r>
         <w:rPr>

</xml_diff>